<commit_message>
fix(cms): make guide generator CWD-independent
</commit_message>
<xml_diff>
--- a/docs/Scope-Screenings-CMS-Guide.docx
+++ b/docs/Scope-Screenings-CMS-Guide.docx
@@ -145,7 +145,7 @@
           <w:color w:val="141210"/>
           <w:sz w:val="21"/>
         </w:rPr>
-        <w:t>the small label above the title (e.g. “Chapter Three”).</w:t>
+        <w:t>the small label above the title (e.g. "Chapter Three").</w:t>
       </w:r>
     </w:p>
     <w:p>
@@ -287,7 +287,7 @@
           <w:color w:val="141210"/>
           <w:sz w:val="21"/>
         </w:rPr>
-        <w:t>Each row is one phrase. The “Now Showing” date is automatic from your ticketing — you don’t edit that.</w:t>
+        <w:t>Each row is one phrase. The "Now Showing" date is automatic from your ticketing — you don't edit that.</w:t>
       </w:r>
     </w:p>
     <w:p>

</xml_diff>

<commit_message>
fix(cms): restore test env var, real docx heading spacing, http url test
- lib/wix-token.test.ts: capture and restore WIX_CLIENT_ID env var to prevent test pollution
- scripts/build-cms-guide.py: fix heading() to use p.paragraph_format.space_before (was inert no-op)
- lib/wix-media.test.ts: add http:// URL test case alongside existing https case
- docs/Scope-Screenings-CMS-Guide.docx: regenerated with corrected heading spacing

Co-Authored-By: Claude Opus 4.8 (1M context) <noreply@anthropic.com>
</commit_message>
<xml_diff>
--- a/docs/Scope-Screenings-CMS-Guide.docx
+++ b/docs/Scope-Screenings-CMS-Guide.docx
@@ -70,6 +70,9 @@
       </w:r>
     </w:p>
     <w:p>
+      <w:pPr>
+        <w:spacing w:before="160"/>
+      </w:pPr>
       <w:r>
         <w:rPr>
           <w:rFonts w:ascii="Aachen Bold" w:hAnsi="Aachen Bold"/>
@@ -92,6 +95,9 @@
       </w:r>
     </w:p>
     <w:p>
+      <w:pPr>
+        <w:spacing w:before="160"/>
+      </w:pPr>
       <w:r>
         <w:rPr>
           <w:rFonts w:ascii="Aachen Bold" w:hAnsi="Aachen Bold"/>
@@ -241,6 +247,9 @@
       </w:r>
     </w:p>
     <w:p>
+      <w:pPr>
+        <w:spacing w:before="160"/>
+      </w:pPr>
       <w:r>
         <w:rPr>
           <w:rFonts w:ascii="Aachen Bold" w:hAnsi="Aachen Bold"/>
@@ -266,6 +275,9 @@
       </w:r>
     </w:p>
     <w:p>
+      <w:pPr>
+        <w:spacing w:before="160"/>
+      </w:pPr>
       <w:r>
         <w:rPr>
           <w:rFonts w:ascii="Aachen Bold" w:hAnsi="Aachen Bold"/>
@@ -291,6 +303,9 @@
       </w:r>
     </w:p>
     <w:p>
+      <w:pPr>
+        <w:spacing w:before="160"/>
+      </w:pPr>
       <w:r>
         <w:rPr>
           <w:rFonts w:ascii="Aachen Bold" w:hAnsi="Aachen Bold"/>
@@ -330,6 +345,9 @@
       </w:r>
     </w:p>
     <w:p>
+      <w:pPr>
+        <w:spacing w:before="160"/>
+      </w:pPr>
       <w:r>
         <w:rPr>
           <w:rFonts w:ascii="Aachen Bold" w:hAnsi="Aachen Bold"/>

</xml_diff>

<commit_message>
docs(cms): regenerate editor guide for per-section structure
Co-Authored-By: Claude Opus 4.8 (1M context) <noreply@anthropic.com>
</commit_message>
<xml_diff>
--- a/docs/Scope-Screenings-CMS-Guide.docx
+++ b/docs/Scope-Screenings-CMS-Guide.docx
@@ -91,7 +91,7 @@
           <w:color w:val="141210"/>
           <w:sz w:val="21"/>
         </w:rPr>
-        <w:t>Open the CMS in your Wix dashboard → pick the collection → edit the fields → click Publish. Your live site updates within the hour.</w:t>
+        <w:t>Open the CMS in your Wix dashboard → pick the collection for the part of the page you want to change → edit the fields → click Publish. Your live site updates within the hour.</w:t>
       </w:r>
     </w:p>
     <w:p>
@@ -105,7 +105,32 @@
           <w:color w:val="B13A2A"/>
           <w:sz w:val="26"/>
         </w:rPr>
-        <w:t>Sections — edit any section's words, title, image, or button</w:t>
+        <w:t>How it's organized</w:t>
+      </w:r>
+    </w:p>
+    <w:p>
+      <w:r>
+        <w:rPr>
+          <w:rFonts w:ascii="Libre Franklin" w:hAnsi="Libre Franklin"/>
+          <w:b w:val="0"/>
+          <w:color w:val="141210"/>
+          <w:sz w:val="21"/>
+        </w:rPr>
+        <w:t>Every part of the page is its own collection, named after the section. A section's form holds its words &amp; images; its matching "— List" collections hold repeating rows. They sit next to each other in the sidebar.</w:t>
+      </w:r>
+    </w:p>
+    <w:p>
+      <w:pPr>
+        <w:spacing w:before="160"/>
+      </w:pPr>
+      <w:r>
+        <w:rPr>
+          <w:rFonts w:ascii="Aachen Bold" w:hAnsi="Aachen Bold"/>
+          <w:b w:val="0"/>
+          <w:color w:val="B13A2A"/>
+          <w:sz w:val="26"/>
+        </w:rPr>
+        <w:t>Section forms — open and edit the fields</w:t>
       </w:r>
     </w:p>
     <w:p>
@@ -119,7 +144,7 @@
           <w:color w:val="141210"/>
           <w:sz w:val="21"/>
         </w:rPr>
-        <w:t xml:space="preserve">Title: </w:t>
+        <w:t xml:space="preserve">Hero: </w:t>
       </w:r>
       <w:r>
         <w:rPr>
@@ -128,7 +153,7 @@
           <w:color w:val="141210"/>
           <w:sz w:val="21"/>
         </w:rPr>
-        <w:t>the big heading for that section.</w:t>
+        <w:t>eyebrow, title (wordmark), tagline, poster image, video.</w:t>
       </w:r>
     </w:p>
     <w:p>
@@ -142,7 +167,7 @@
           <w:color w:val="141210"/>
           <w:sz w:val="21"/>
         </w:rPr>
-        <w:t xml:space="preserve">Eyebrow: </w:t>
+        <w:t xml:space="preserve">WhatIs: </w:t>
       </w:r>
       <w:r>
         <w:rPr>
@@ -151,7 +176,7 @@
           <w:color w:val="141210"/>
           <w:sz w:val="21"/>
         </w:rPr>
-        <w:t>the small label above the title (e.g. "Chapter Three").</w:t>
+        <w:t>eyebrow, title, body, motto quote.</w:t>
       </w:r>
     </w:p>
     <w:p>
@@ -165,7 +190,7 @@
           <w:color w:val="141210"/>
           <w:sz w:val="21"/>
         </w:rPr>
-        <w:t xml:space="preserve">Body: </w:t>
+        <w:t xml:space="preserve">BuiltForAccess: </w:t>
       </w:r>
       <w:r>
         <w:rPr>
@@ -174,7 +199,7 @@
           <w:color w:val="141210"/>
           <w:sz w:val="21"/>
         </w:rPr>
-        <w:t>the paragraph text.</w:t>
+        <w:t>heading, founder quote, founder name / title / credential, founder photo.</w:t>
       </w:r>
     </w:p>
     <w:p>
@@ -188,7 +213,7 @@
           <w:color w:val="141210"/>
           <w:sz w:val="21"/>
         </w:rPr>
-        <w:t xml:space="preserve">Image: </w:t>
+        <w:t xml:space="preserve">MagicGallery: </w:t>
       </w:r>
       <w:r>
         <w:rPr>
@@ -197,7 +222,7 @@
           <w:color w:val="141210"/>
           <w:sz w:val="21"/>
         </w:rPr>
-        <w:t>upload a new photo for that section.</w:t>
+        <w:t>heading, body, button label + link.</w:t>
       </w:r>
     </w:p>
     <w:p>
@@ -211,7 +236,7 @@
           <w:color w:val="141210"/>
           <w:sz w:val="21"/>
         </w:rPr>
-        <w:t xml:space="preserve">Button label / Button link: </w:t>
+        <w:t xml:space="preserve">Submissions: </w:t>
       </w:r>
       <w:r>
         <w:rPr>
@@ -220,7 +245,7 @@
           <w:color w:val="141210"/>
           <w:sz w:val="21"/>
         </w:rPr>
-        <w:t>the button text and where it links (e.g. the Submit button → FilmFreeway).</w:t>
+        <w:t>heading, intro, button label + link (→ FilmFreeway).</w:t>
       </w:r>
     </w:p>
     <w:p>
@@ -234,7 +259,7 @@
           <w:color w:val="141210"/>
           <w:sz w:val="21"/>
         </w:rPr>
-        <w:t xml:space="preserve">Section key: </w:t>
+        <w:t xml:space="preserve">Archives: </w:t>
       </w:r>
       <w:r>
         <w:rPr>
@@ -243,7 +268,76 @@
           <w:color w:val="141210"/>
           <w:sz w:val="21"/>
         </w:rPr>
-        <w:t>leave this alone — it tells the website which section this is.</w:t>
+        <w:t>heading, body, button label + link.</w:t>
+      </w:r>
+    </w:p>
+    <w:p>
+      <w:pPr>
+        <w:pStyle w:val="ListBullet"/>
+      </w:pPr>
+      <w:r>
+        <w:rPr>
+          <w:rFonts w:ascii="Libre Franklin" w:hAnsi="Libre Franklin"/>
+          <w:b/>
+          <w:color w:val="141210"/>
+          <w:sz w:val="21"/>
+        </w:rPr>
+        <w:t xml:space="preserve">Support: </w:t>
+      </w:r>
+      <w:r>
+        <w:rPr>
+          <w:rFonts w:ascii="Libre Franklin" w:hAnsi="Libre Franklin"/>
+          <w:b w:val="0"/>
+          <w:color w:val="141210"/>
+          <w:sz w:val="21"/>
+        </w:rPr>
+        <w:t>funder &amp; press copy, donate link, press email, button labels.</w:t>
+      </w:r>
+    </w:p>
+    <w:p>
+      <w:pPr>
+        <w:pStyle w:val="ListBullet"/>
+      </w:pPr>
+      <w:r>
+        <w:rPr>
+          <w:rFonts w:ascii="Libre Franklin" w:hAnsi="Libre Franklin"/>
+          <w:b/>
+          <w:color w:val="141210"/>
+          <w:sz w:val="21"/>
+        </w:rPr>
+        <w:t xml:space="preserve">Footer: </w:t>
+      </w:r>
+      <w:r>
+        <w:rPr>
+          <w:rFonts w:ascii="Libre Franklin" w:hAnsi="Libre Franklin"/>
+          <w:b w:val="0"/>
+          <w:color w:val="141210"/>
+          <w:sz w:val="21"/>
+        </w:rPr>
+        <w:t>sign-off, tagline, newsletter heading, copyright, contact email.</w:t>
+      </w:r>
+    </w:p>
+    <w:p>
+      <w:pPr>
+        <w:pStyle w:val="ListBullet"/>
+      </w:pPr>
+      <w:r>
+        <w:rPr>
+          <w:rFonts w:ascii="Libre Franklin" w:hAnsi="Libre Franklin"/>
+          <w:b/>
+          <w:color w:val="141210"/>
+          <w:sz w:val="21"/>
+        </w:rPr>
+        <w:t xml:space="preserve">SiteSettings: </w:t>
+      </w:r>
+      <w:r>
+        <w:rPr>
+          <w:rFonts w:ascii="Libre Franklin" w:hAnsi="Libre Franklin"/>
+          <w:b w:val="0"/>
+          <w:color w:val="141210"/>
+          <w:sz w:val="21"/>
+        </w:rPr>
+        <w:t>venue name &amp; address.</w:t>
       </w:r>
     </w:p>
     <w:p>
@@ -257,7 +351,7 @@
           <w:color w:val="B13A2A"/>
           <w:sz w:val="26"/>
         </w:rPr>
-        <w:t>Partners — add or change sponsors</w:t>
+        <w:t>List collections — add, remove, or reorder rows (set the Order number)</w:t>
       </w:r>
     </w:p>
     <w:p>
@@ -271,7 +365,7 @@
           <w:color w:val="141210"/>
           <w:sz w:val="21"/>
         </w:rPr>
-        <w:t>Add a row for a new partner: name, logo (upload), link, and order. Remove a row to drop a partner.</w:t>
+        <w:t>WhatIs — Clapperboard (slate lines) · BuiltForAccess — Stats · MagicGallery — Moments (reel photos) · Submissions — Chips · Support — Giving Tiers · Support — Press Kit (with links) · Partners · Marquee (banner phrases) · Socials.</w:t>
       </w:r>
     </w:p>
     <w:p>
@@ -285,7 +379,7 @@
           <w:color w:val="B13A2A"/>
           <w:sz w:val="26"/>
         </w:rPr>
-        <w:t>Marquee — the scrolling banner under the hero</w:t>
+        <w:t>Photos &amp; video</w:t>
       </w:r>
     </w:p>
     <w:p>
@@ -299,49 +393,7 @@
           <w:color w:val="141210"/>
           <w:sz w:val="21"/>
         </w:rPr>
-        <w:t>Each row is one phrase. The "Now Showing" date is automatic from your ticketing — you don't edit that.</w:t>
-      </w:r>
-    </w:p>
-    <w:p>
-      <w:pPr>
-        <w:spacing w:before="160"/>
-      </w:pPr>
-      <w:r>
-        <w:rPr>
-          <w:rFonts w:ascii="Aachen Bold" w:hAnsi="Aachen Bold"/>
-          <w:b w:val="0"/>
-          <w:color w:val="B13A2A"/>
-          <w:sz w:val="26"/>
-        </w:rPr>
-        <w:t>Socials &amp; Settings</w:t>
-      </w:r>
-    </w:p>
-    <w:p>
-      <w:pPr>
-        <w:pStyle w:val="ListBullet"/>
-      </w:pPr>
-      <w:r>
-        <w:rPr>
-          <w:rFonts w:ascii="Libre Franklin" w:hAnsi="Libre Franklin"/>
-          <w:b w:val="0"/>
-          <w:color w:val="141210"/>
-          <w:sz w:val="21"/>
-        </w:rPr>
-        <w:t>Socials: add/edit the Instagram, TikTok, YouTube links in the footer.</w:t>
-      </w:r>
-    </w:p>
-    <w:p>
-      <w:pPr>
-        <w:pStyle w:val="ListBullet"/>
-      </w:pPr>
-      <w:r>
-        <w:rPr>
-          <w:rFonts w:ascii="Libre Franklin" w:hAnsi="Libre Franklin"/>
-          <w:b w:val="0"/>
-          <w:color w:val="141210"/>
-          <w:sz w:val="21"/>
-        </w:rPr>
-        <w:t>Settings: contact email, venue name/address, door &amp; screening times, newsletter heading, footer tagline, copyright.</w:t>
+        <w:t>In any Image or Video field, upload/select in the Media Manager. Leave it empty and the built-in default shows.</w:t>
       </w:r>
     </w:p>
     <w:p>
@@ -369,7 +421,7 @@
           <w:color w:val="141210"/>
           <w:sz w:val="21"/>
         </w:rPr>
-        <w:t>Tickets and the Schedule come straight from Wix Events — manage those where you already sell tickets.</w:t>
+        <w:t>Tickets and the Schedule come from Wix Events. Submission deadlines are set in the code. The marquee "Now Showing" date is automatic.</w:t>
       </w:r>
     </w:p>
     <w:sectPr>

</xml_diff>